<commit_message>
Add answers for the 5 questions
</commit_message>
<xml_diff>
--- a/IT110_Activity9_Evidence_Report_Semester_Project.docx
+++ b/IT110_Activity9_Evidence_Report_Semester_Project.docx
@@ -93,7 +93,7 @@
         </w:rPr>
         <w:t xml:space="preserve"> repository link: </w:t>
       </w:r>
-      <w:hyperlink r:id="rId4" w:history="1">
+      <w:hyperlink r:id="rId5" w:history="1">
         <w:r>
           <w:rPr>
             <w:rStyle w:val="Hyperlink"/>
@@ -186,7 +186,7 @@
                     <pic:cNvPicPr/>
                   </pic:nvPicPr>
                   <pic:blipFill>
-                    <a:blip r:embed="rId5">
+                    <a:blip r:embed="rId6">
                       <a:extLst>
                         <a:ext uri="{28A0092B-C50C-407E-A947-70E740481C1C}">
                           <a14:useLocalDpi xmlns:a14="http://schemas.microsoft.com/office/drawing/2010/main" val="0"/>
@@ -347,7 +347,7 @@
                     <pic:cNvPicPr/>
                   </pic:nvPicPr>
                   <pic:blipFill>
-                    <a:blip r:embed="rId6" cstate="print">
+                    <a:blip r:embed="rId7" cstate="print">
                       <a:extLst>
                         <a:ext uri="{28A0092B-C50C-407E-A947-70E740481C1C}">
                           <a14:useLocalDpi xmlns:a14="http://schemas.microsoft.com/office/drawing/2010/main" val="0"/>
@@ -599,7 +599,7 @@
                     <pic:cNvPicPr/>
                   </pic:nvPicPr>
                   <pic:blipFill>
-                    <a:blip r:embed="rId7" cstate="print">
+                    <a:blip r:embed="rId8" cstate="print">
                       <a:extLst>
                         <a:ext uri="{28A0092B-C50C-407E-A947-70E740481C1C}">
                           <a14:useLocalDpi xmlns:a14="http://schemas.microsoft.com/office/drawing/2010/main" val="0"/>
@@ -815,7 +815,7 @@
                     <pic:cNvPicPr/>
                   </pic:nvPicPr>
                   <pic:blipFill>
-                    <a:blip r:embed="rId8" cstate="print">
+                    <a:blip r:embed="rId9" cstate="print">
                       <a:extLst>
                         <a:ext uri="{28A0092B-C50C-407E-A947-70E740481C1C}">
                           <a14:useLocalDpi xmlns:a14="http://schemas.microsoft.com/office/drawing/2010/main" val="0"/>
@@ -966,7 +966,7 @@
                     <pic:cNvPicPr/>
                   </pic:nvPicPr>
                   <pic:blipFill>
-                    <a:blip r:embed="rId9" cstate="print">
+                    <a:blip r:embed="rId10" cstate="print">
                       <a:extLst>
                         <a:ext uri="{28A0092B-C50C-407E-A947-70E740481C1C}">
                           <a14:useLocalDpi xmlns:a14="http://schemas.microsoft.com/office/drawing/2010/main" val="0"/>
@@ -1075,7 +1075,6 @@
       <w:pPr>
         <w:rPr>
           <w:rFonts w:ascii="Aptos Display" w:hAnsi="Aptos Display"/>
-          <w:lang w:val="en-US"/>
         </w:rPr>
       </w:pPr>
       <w:r>
@@ -1120,7 +1119,7 @@
                     <pic:cNvPicPr/>
                   </pic:nvPicPr>
                   <pic:blipFill>
-                    <a:blip r:embed="rId10" cstate="print">
+                    <a:blip r:embed="rId11" cstate="print">
                       <a:extLst>
                         <a:ext uri="{28A0092B-C50C-407E-A947-70E740481C1C}">
                           <a14:useLocalDpi xmlns:a14="http://schemas.microsoft.com/office/drawing/2010/main" val="0"/>
@@ -1189,6 +1188,369 @@
         <w:t>The Error state was triggered by turning on the Simulate submission error toggle, entering valid report details, and clicking Submit Report, which displayed an error message with a Retry option.</w:t>
       </w:r>
     </w:p>
+    <w:p>
+      <w:pPr>
+        <w:rPr>
+          <w:rFonts w:ascii="Aptos Display" w:hAnsi="Aptos Display"/>
+        </w:rPr>
+      </w:pPr>
+    </w:p>
+    <w:p>
+      <w:pPr>
+        <w:rPr>
+          <w:rFonts w:ascii="Aptos Display" w:hAnsi="Aptos Display"/>
+        </w:rPr>
+      </w:pPr>
+    </w:p>
+    <w:p>
+      <w:pPr>
+        <w:rPr>
+          <w:rFonts w:ascii="Aptos Display" w:hAnsi="Aptos Display"/>
+        </w:rPr>
+      </w:pPr>
+    </w:p>
+    <w:p>
+      <w:pPr>
+        <w:jc w:val="both"/>
+        <w:rPr>
+          <w:rFonts w:ascii="Aptos Display" w:hAnsi="Aptos Display"/>
+          <w:b/>
+          <w:bCs/>
+        </w:rPr>
+      </w:pPr>
+      <w:r>
+        <w:rPr>
+          <w:rFonts w:ascii="Aptos Display" w:hAnsi="Aptos Display"/>
+          <w:b/>
+          <w:bCs/>
+        </w:rPr>
+        <w:t xml:space="preserve">1. How does </w:t>
+      </w:r>
+      <w:proofErr w:type="spellStart"/>
+      <w:r>
+        <w:rPr>
+          <w:rFonts w:ascii="Aptos Display" w:hAnsi="Aptos Display"/>
+          <w:b/>
+          <w:bCs/>
+        </w:rPr>
+        <w:t>report_form_</w:t>
+      </w:r>
+      <w:proofErr w:type="gramStart"/>
+      <w:r>
+        <w:rPr>
+          <w:rFonts w:ascii="Aptos Display" w:hAnsi="Aptos Display"/>
+          <w:b/>
+          <w:bCs/>
+        </w:rPr>
+        <w:t>screen.dart</w:t>
+      </w:r>
+      <w:proofErr w:type="spellEnd"/>
+      <w:proofErr w:type="gramEnd"/>
+      <w:r>
+        <w:rPr>
+          <w:rFonts w:ascii="Aptos Display" w:hAnsi="Aptos Display"/>
+          <w:b/>
+          <w:bCs/>
+        </w:rPr>
+        <w:t xml:space="preserve"> extend your Activity 8 project without replacing its existing Home and Login screens?</w:t>
+      </w:r>
+    </w:p>
+    <w:p>
+      <w:pPr>
+        <w:jc w:val="both"/>
+        <w:rPr>
+          <w:rFonts w:ascii="Aptos Display" w:hAnsi="Aptos Display"/>
+        </w:rPr>
+      </w:pPr>
+      <w:r>
+        <w:rPr>
+          <w:rFonts w:ascii="Aptos Display" w:hAnsi="Aptos Display"/>
+        </w:rPr>
+        <w:t xml:space="preserve">- </w:t>
+      </w:r>
+      <w:r>
+        <w:rPr>
+          <w:rFonts w:ascii="Aptos Display" w:hAnsi="Aptos Display"/>
+        </w:rPr>
+        <w:t xml:space="preserve">The </w:t>
+      </w:r>
+      <w:proofErr w:type="spellStart"/>
+      <w:r>
+        <w:rPr>
+          <w:rFonts w:ascii="Aptos Display" w:hAnsi="Aptos Display"/>
+        </w:rPr>
+        <w:t>report_form_</w:t>
+      </w:r>
+      <w:proofErr w:type="gramStart"/>
+      <w:r>
+        <w:rPr>
+          <w:rFonts w:ascii="Aptos Display" w:hAnsi="Aptos Display"/>
+        </w:rPr>
+        <w:t>screen.dart</w:t>
+      </w:r>
+      <w:proofErr w:type="spellEnd"/>
+      <w:proofErr w:type="gramEnd"/>
+      <w:r>
+        <w:rPr>
+          <w:rFonts w:ascii="Aptos Display" w:hAnsi="Aptos Display"/>
+        </w:rPr>
+        <w:t xml:space="preserve"> adds a new Report Form screen to our existing Flutter project. It connects to the </w:t>
+      </w:r>
+      <w:proofErr w:type="gramStart"/>
+      <w:r>
+        <w:rPr>
+          <w:rFonts w:ascii="Aptos Display" w:hAnsi="Aptos Display"/>
+        </w:rPr>
+        <w:t>Home</w:t>
+      </w:r>
+      <w:proofErr w:type="gramEnd"/>
+      <w:r>
+        <w:rPr>
+          <w:rFonts w:ascii="Aptos Display" w:hAnsi="Aptos Display"/>
+        </w:rPr>
+        <w:t xml:space="preserve"> screen through navigation, while the Home and Login screens remain available. This allows us to add new features without creating a new project.</w:t>
+      </w:r>
+    </w:p>
+    <w:p>
+      <w:pPr>
+        <w:jc w:val="both"/>
+        <w:rPr>
+          <w:rFonts w:ascii="Aptos Display" w:hAnsi="Aptos Display"/>
+          <w:b/>
+          <w:bCs/>
+        </w:rPr>
+      </w:pPr>
+      <w:r>
+        <w:rPr>
+          <w:rFonts w:ascii="Aptos Display" w:hAnsi="Aptos Display"/>
+          <w:b/>
+          <w:bCs/>
+        </w:rPr>
+        <w:t>2. Which shared widget did your group reuse, and what benefit does that provide?</w:t>
+      </w:r>
+    </w:p>
+    <w:p>
+      <w:pPr>
+        <w:jc w:val="both"/>
+        <w:rPr>
+          <w:rFonts w:ascii="Aptos Display" w:hAnsi="Aptos Display"/>
+        </w:rPr>
+      </w:pPr>
+      <w:r>
+        <w:rPr>
+          <w:rFonts w:ascii="Aptos Display" w:hAnsi="Aptos Display"/>
+        </w:rPr>
+        <w:t xml:space="preserve">- </w:t>
+      </w:r>
+      <w:r>
+        <w:rPr>
+          <w:rFonts w:ascii="Aptos Display" w:hAnsi="Aptos Display"/>
+        </w:rPr>
+        <w:t xml:space="preserve">Our group reused </w:t>
+      </w:r>
+      <w:proofErr w:type="spellStart"/>
+      <w:r>
+        <w:rPr>
+          <w:rFonts w:ascii="Aptos Display" w:hAnsi="Aptos Display"/>
+        </w:rPr>
+        <w:t>AppButton</w:t>
+      </w:r>
+      <w:proofErr w:type="spellEnd"/>
+      <w:r>
+        <w:rPr>
+          <w:rFonts w:ascii="Aptos Display" w:hAnsi="Aptos Display"/>
+        </w:rPr>
+        <w:t xml:space="preserve"> and </w:t>
+      </w:r>
+      <w:proofErr w:type="spellStart"/>
+      <w:r>
+        <w:rPr>
+          <w:rFonts w:ascii="Aptos Display" w:hAnsi="Aptos Display"/>
+        </w:rPr>
+        <w:t>AppTextField</w:t>
+      </w:r>
+      <w:proofErr w:type="spellEnd"/>
+      <w:r>
+        <w:rPr>
+          <w:rFonts w:ascii="Aptos Display" w:hAnsi="Aptos Display"/>
+        </w:rPr>
+        <w:t xml:space="preserve">. </w:t>
+      </w:r>
+      <w:proofErr w:type="spellStart"/>
+      <w:r>
+        <w:rPr>
+          <w:rFonts w:ascii="Aptos Display" w:hAnsi="Aptos Display"/>
+        </w:rPr>
+        <w:t>AppButton</w:t>
+      </w:r>
+      <w:proofErr w:type="spellEnd"/>
+      <w:r>
+        <w:rPr>
+          <w:rFonts w:ascii="Aptos Display" w:hAnsi="Aptos Display"/>
+        </w:rPr>
+        <w:t xml:space="preserve"> is used in the Report Form and Login screen, while </w:t>
+      </w:r>
+      <w:proofErr w:type="spellStart"/>
+      <w:r>
+        <w:rPr>
+          <w:rFonts w:ascii="Aptos Display" w:hAnsi="Aptos Display"/>
+        </w:rPr>
+        <w:t>AppTextField</w:t>
+      </w:r>
+      <w:proofErr w:type="spellEnd"/>
+      <w:r>
+        <w:rPr>
+          <w:rFonts w:ascii="Aptos Display" w:hAnsi="Aptos Display"/>
+        </w:rPr>
+        <w:t xml:space="preserve"> is used for the report title and description. These widgets help us reuse code, keep the design consistent, and make the code easier to maintain.</w:t>
+      </w:r>
+    </w:p>
+    <w:p>
+      <w:pPr>
+        <w:jc w:val="both"/>
+        <w:rPr>
+          <w:rFonts w:ascii="Aptos Display" w:hAnsi="Aptos Display"/>
+        </w:rPr>
+      </w:pPr>
+    </w:p>
+    <w:p>
+      <w:pPr>
+        <w:jc w:val="both"/>
+        <w:rPr>
+          <w:rFonts w:ascii="Aptos Display" w:hAnsi="Aptos Display"/>
+        </w:rPr>
+      </w:pPr>
+    </w:p>
+    <w:p>
+      <w:pPr>
+        <w:jc w:val="both"/>
+        <w:rPr>
+          <w:rFonts w:ascii="Aptos Display" w:hAnsi="Aptos Display"/>
+          <w:b/>
+          <w:bCs/>
+        </w:rPr>
+      </w:pPr>
+      <w:r>
+        <w:rPr>
+          <w:rFonts w:ascii="Aptos Display" w:hAnsi="Aptos Display"/>
+          <w:b/>
+          <w:bCs/>
+        </w:rPr>
+        <w:lastRenderedPageBreak/>
+        <w:t>3. How does your report form prevent invalid input and duplicate submissions?</w:t>
+      </w:r>
+    </w:p>
+    <w:p>
+      <w:pPr>
+        <w:jc w:val="both"/>
+        <w:rPr>
+          <w:rFonts w:ascii="Aptos Display" w:hAnsi="Aptos Display"/>
+        </w:rPr>
+      </w:pPr>
+      <w:r>
+        <w:rPr>
+          <w:rFonts w:ascii="Aptos Display" w:hAnsi="Aptos Display"/>
+        </w:rPr>
+        <w:t xml:space="preserve">- </w:t>
+      </w:r>
+      <w:r>
+        <w:rPr>
+          <w:rFonts w:ascii="Aptos Display" w:hAnsi="Aptos Display"/>
+        </w:rPr>
+        <w:t>The form uses validation to make sure the report title and description are not empty and meet the required length. The Submit Report button is disabled while the form is loading. This prevents users from submitting the form multiple times at once.</w:t>
+      </w:r>
+    </w:p>
+    <w:p>
+      <w:pPr>
+        <w:jc w:val="both"/>
+        <w:rPr>
+          <w:rFonts w:ascii="Aptos Display" w:hAnsi="Aptos Display"/>
+          <w:b/>
+          <w:bCs/>
+        </w:rPr>
+      </w:pPr>
+      <w:r>
+        <w:rPr>
+          <w:rFonts w:ascii="Aptos Display" w:hAnsi="Aptos Display"/>
+          <w:b/>
+          <w:bCs/>
+        </w:rPr>
+        <w:t>4. How did you reproduce the Loading, Success, Empty, and Error responses? Which were simulated?</w:t>
+      </w:r>
+    </w:p>
+    <w:p>
+      <w:pPr>
+        <w:jc w:val="both"/>
+        <w:rPr>
+          <w:rFonts w:ascii="Aptos Display" w:hAnsi="Aptos Display"/>
+        </w:rPr>
+      </w:pPr>
+      <w:r>
+        <w:rPr>
+          <w:rFonts w:ascii="Aptos Display" w:hAnsi="Aptos Display"/>
+        </w:rPr>
+        <w:t xml:space="preserve">- </w:t>
+      </w:r>
+      <w:r>
+        <w:rPr>
+          <w:rFonts w:ascii="Aptos Display" w:hAnsi="Aptos Display"/>
+        </w:rPr>
+        <w:t>We reproduced the Loading state by submitting a valid report and showing a progress indicator for three seconds. The Success state appeared after a valid submission with the error toggle turned off. The Empty state appeared when we clicked the View Empty State button. The Error state appeared when we turned on the simulated error toggle and submitted the form. All responses were simulated because no backend was connected.</w:t>
+      </w:r>
+    </w:p>
+    <w:p>
+      <w:pPr>
+        <w:jc w:val="both"/>
+        <w:rPr>
+          <w:rFonts w:ascii="Aptos Display" w:hAnsi="Aptos Display"/>
+          <w:b/>
+          <w:bCs/>
+        </w:rPr>
+      </w:pPr>
+      <w:r>
+        <w:rPr>
+          <w:rFonts w:ascii="Aptos Display" w:hAnsi="Aptos Display"/>
+          <w:b/>
+          <w:bCs/>
+        </w:rPr>
+        <w:t>5. What must be changed when the real REST API and PostgreSQL database are connected later?</w:t>
+      </w:r>
+    </w:p>
+    <w:p>
+      <w:pPr>
+        <w:jc w:val="both"/>
+        <w:rPr>
+          <w:rFonts w:ascii="Aptos Display" w:hAnsi="Aptos Display"/>
+        </w:rPr>
+      </w:pPr>
+      <w:r>
+        <w:rPr>
+          <w:rFonts w:ascii="Aptos Display" w:hAnsi="Aptos Display"/>
+        </w:rPr>
+        <w:t xml:space="preserve">- </w:t>
+      </w:r>
+      <w:r>
+        <w:rPr>
+          <w:rFonts w:ascii="Aptos Display" w:hAnsi="Aptos Display"/>
+        </w:rPr>
+        <w:t>We need to connect the report form to the real REST API and PostgreSQL database. We must replace the simulated delay and responses with actual API requests. The application should send report details to the server, save them in the database, and display the correct Loading, Success, Empty, or Error response based on the actual result.</w:t>
+      </w:r>
+    </w:p>
+    <w:p>
+      <w:pPr>
+        <w:rPr>
+          <w:rFonts w:ascii="Aptos Display" w:hAnsi="Aptos Display"/>
+          <w:lang w:val="en-US"/>
+        </w:rPr>
+      </w:pPr>
+      <w:r>
+        <w:rPr>
+          <w:rFonts w:ascii="Aptos Display" w:hAnsi="Aptos Display"/>
+          <w:lang w:val="en-US"/>
+        </w:rPr>
+        <w:t xml:space="preserve"> </w:t>
+      </w:r>
+    </w:p>
     <w:sectPr>
       <w:pgSz w:w="12240" w:h="15840"/>
       <w:pgMar w:top="1440" w:right="1440" w:bottom="1440" w:left="1440" w:header="708" w:footer="708" w:gutter="0"/>
@@ -1197,6 +1559,127 @@
     </w:sectPr>
   </w:body>
 </w:document>
+</file>
+
+<file path=word/numbering.xml><?xml version="1.0" encoding="utf-8"?>
+<w:numbering xmlns:wpc="http://schemas.microsoft.com/office/word/2010/wordprocessingCanvas" xmlns:cx="http://schemas.microsoft.com/office/drawing/2014/chartex" xmlns:cx1="http://schemas.microsoft.com/office/drawing/2015/9/8/chartex" xmlns:cx2="http://schemas.microsoft.com/office/drawing/2015/10/21/chartex" xmlns:cx3="http://schemas.microsoft.com/office/drawing/2016/5/9/chartex" xmlns:cx4="http://schemas.microsoft.com/office/drawing/2016/5/10/chartex" xmlns:cx5="http://schemas.microsoft.com/office/drawing/2016/5/11/chartex" xmlns:cx6="http://schemas.microsoft.com/office/drawing/2016/5/12/chartex" xmlns:cx7="http://schemas.microsoft.com/office/drawing/2016/5/13/chartex" xmlns:cx8="http://schemas.microsoft.com/office/drawing/2016/5/14/chartex" xmlns:mc="http://schemas.openxmlformats.org/markup-compatibility/2006" xmlns:aink="http://schemas.microsoft.com/office/drawing/2016/ink" xmlns:am3d="http://schemas.microsoft.com/office/drawing/2017/model3d" xmlns:o="urn:schemas-microsoft-com:office:office" xmlns:oel="http://schemas.microsoft.com/office/2019/extlst" xmlns:r="http://schemas.openxmlformats.org/officeDocument/2006/relationships" xmlns:m="http://schemas.openxmlformats.org/officeDocument/2006/math" xmlns:v="urn:schemas-microsoft-com:vml" xmlns:wp14="http://schemas.microsoft.com/office/word/2010/wordprocessingDrawing" xmlns:wp="http://schemas.openxmlformats.org/drawingml/2006/wordprocessingDrawing" xmlns:w10="urn:schemas-microsoft-com:office:word" xmlns:w="http://schemas.openxmlformats.org/wordprocessingml/2006/main" xmlns:w14="http://schemas.microsoft.com/office/word/2010/wordml" xmlns:w15="http://schemas.microsoft.com/office/word/2012/wordml" xmlns:w16cex="http://schemas.microsoft.com/office/word/2018/wordml/cex" xmlns:w16cid="http://schemas.microsoft.com/office/word/2016/wordml/cid" xmlns:w16="http://schemas.microsoft.com/office/word/2018/wordml" xmlns:w16du="http://schemas.microsoft.com/office/word/2023/wordml/word16du" xmlns:w16sdtdh="http://schemas.microsoft.com/office/word/2020/wordml/sdtdatahash" xmlns:w16sdtfl="http://schemas.microsoft.com/office/word/2024/wordml/sdtformatlock" xmlns:w16se="http://schemas.microsoft.com/office/word/2015/wordml/symex" xmlns:wpg="http://schemas.microsoft.com/office/word/2010/wordprocessingGroup" xmlns:wpi="http://schemas.microsoft.com/office/word/2010/wordprocessingInk" xmlns:wne="http://schemas.microsoft.com/office/word/2006/wordml" xmlns:wps="http://schemas.microsoft.com/office/word/2010/wordprocessingShape" mc:Ignorable="w14 w15 w16se w16cid w16 w16cex w16sdtdh w16sdtfl w16du wp14">
+  <w:abstractNum w:abstractNumId="0" w15:restartNumberingAfterBreak="0">
+    <w:nsid w:val="21945679"/>
+    <w:multiLevelType w:val="hybridMultilevel"/>
+    <w:tmpl w:val="4D9CC92E"/>
+    <w:lvl w:ilvl="0" w:tplc="34090001">
+      <w:start w:val="1"/>
+      <w:numFmt w:val="bullet"/>
+      <w:lvlText w:val=""/>
+      <w:lvlJc w:val="left"/>
+      <w:pPr>
+        <w:ind w:left="720" w:hanging="360"/>
+      </w:pPr>
+      <w:rPr>
+        <w:rFonts w:ascii="Symbol" w:hAnsi="Symbol" w:hint="default"/>
+      </w:rPr>
+    </w:lvl>
+    <w:lvl w:ilvl="1" w:tplc="34090003" w:tentative="1">
+      <w:start w:val="1"/>
+      <w:numFmt w:val="bullet"/>
+      <w:lvlText w:val="o"/>
+      <w:lvlJc w:val="left"/>
+      <w:pPr>
+        <w:ind w:left="1440" w:hanging="360"/>
+      </w:pPr>
+      <w:rPr>
+        <w:rFonts w:ascii="Courier New" w:hAnsi="Courier New" w:cs="Courier New" w:hint="default"/>
+      </w:rPr>
+    </w:lvl>
+    <w:lvl w:ilvl="2" w:tplc="34090005" w:tentative="1">
+      <w:start w:val="1"/>
+      <w:numFmt w:val="bullet"/>
+      <w:lvlText w:val=""/>
+      <w:lvlJc w:val="left"/>
+      <w:pPr>
+        <w:ind w:left="2160" w:hanging="360"/>
+      </w:pPr>
+      <w:rPr>
+        <w:rFonts w:ascii="Wingdings" w:hAnsi="Wingdings" w:hint="default"/>
+      </w:rPr>
+    </w:lvl>
+    <w:lvl w:ilvl="3" w:tplc="34090001" w:tentative="1">
+      <w:start w:val="1"/>
+      <w:numFmt w:val="bullet"/>
+      <w:lvlText w:val=""/>
+      <w:lvlJc w:val="left"/>
+      <w:pPr>
+        <w:ind w:left="2880" w:hanging="360"/>
+      </w:pPr>
+      <w:rPr>
+        <w:rFonts w:ascii="Symbol" w:hAnsi="Symbol" w:hint="default"/>
+      </w:rPr>
+    </w:lvl>
+    <w:lvl w:ilvl="4" w:tplc="34090003" w:tentative="1">
+      <w:start w:val="1"/>
+      <w:numFmt w:val="bullet"/>
+      <w:lvlText w:val="o"/>
+      <w:lvlJc w:val="left"/>
+      <w:pPr>
+        <w:ind w:left="3600" w:hanging="360"/>
+      </w:pPr>
+      <w:rPr>
+        <w:rFonts w:ascii="Courier New" w:hAnsi="Courier New" w:cs="Courier New" w:hint="default"/>
+      </w:rPr>
+    </w:lvl>
+    <w:lvl w:ilvl="5" w:tplc="34090005" w:tentative="1">
+      <w:start w:val="1"/>
+      <w:numFmt w:val="bullet"/>
+      <w:lvlText w:val=""/>
+      <w:lvlJc w:val="left"/>
+      <w:pPr>
+        <w:ind w:left="4320" w:hanging="360"/>
+      </w:pPr>
+      <w:rPr>
+        <w:rFonts w:ascii="Wingdings" w:hAnsi="Wingdings" w:hint="default"/>
+      </w:rPr>
+    </w:lvl>
+    <w:lvl w:ilvl="6" w:tplc="34090001" w:tentative="1">
+      <w:start w:val="1"/>
+      <w:numFmt w:val="bullet"/>
+      <w:lvlText w:val=""/>
+      <w:lvlJc w:val="left"/>
+      <w:pPr>
+        <w:ind w:left="5040" w:hanging="360"/>
+      </w:pPr>
+      <w:rPr>
+        <w:rFonts w:ascii="Symbol" w:hAnsi="Symbol" w:hint="default"/>
+      </w:rPr>
+    </w:lvl>
+    <w:lvl w:ilvl="7" w:tplc="34090003" w:tentative="1">
+      <w:start w:val="1"/>
+      <w:numFmt w:val="bullet"/>
+      <w:lvlText w:val="o"/>
+      <w:lvlJc w:val="left"/>
+      <w:pPr>
+        <w:ind w:left="5760" w:hanging="360"/>
+      </w:pPr>
+      <w:rPr>
+        <w:rFonts w:ascii="Courier New" w:hAnsi="Courier New" w:cs="Courier New" w:hint="default"/>
+      </w:rPr>
+    </w:lvl>
+    <w:lvl w:ilvl="8" w:tplc="34090005" w:tentative="1">
+      <w:start w:val="1"/>
+      <w:numFmt w:val="bullet"/>
+      <w:lvlText w:val=""/>
+      <w:lvlJc w:val="left"/>
+      <w:pPr>
+        <w:ind w:left="6480" w:hanging="360"/>
+      </w:pPr>
+      <w:rPr>
+        <w:rFonts w:ascii="Wingdings" w:hAnsi="Wingdings" w:hint="default"/>
+      </w:rPr>
+    </w:lvl>
+  </w:abstractNum>
+  <w:num w:numId="1" w16cid:durableId="1706758645">
+    <w:abstractNumId w:val="0"/>
+  </w:num>
+</w:numbering>
 </file>
 
 <file path=word/styles.xml><?xml version="1.0" encoding="utf-8"?>

</xml_diff>